<commit_message>
Interview prep: pipeline/MLOps + API/production docs
</commit_message>
<xml_diff>
--- a/docs/interview/01_project_walkthrough.docx
+++ b/docs/interview/01_project_walkthrough.docx
@@ -183,6 +183,62 @@
           </w:p>
         </w:tc>
       </w:tr>
+      <w:tr>
+        <w:tc>
+          <w:p>
+            <w:pPr>
+              <w:pStyle w:val="Compact"/>
+              <w:jc w:val="left"/>
+            </w:pPr>
+            <w:r>
+              <w:rPr>
+                <w:bCs/>
+                <w:b/>
+              </w:rPr>
+              <w:t xml:space="preserve">04: Pipeline and MLOps</w:t>
+            </w:r>
+          </w:p>
+        </w:tc>
+        <w:tc>
+          <w:p>
+            <w:pPr>
+              <w:pStyle w:val="Compact"/>
+              <w:jc w:val="left"/>
+            </w:pPr>
+            <w:r>
+              <w:t xml:space="preserve">The modular pipeline, DVC, MLflow, tests and CI.</w:t>
+            </w:r>
+          </w:p>
+        </w:tc>
+      </w:tr>
+      <w:tr>
+        <w:tc>
+          <w:p>
+            <w:pPr>
+              <w:pStyle w:val="Compact"/>
+              <w:jc w:val="left"/>
+            </w:pPr>
+            <w:r>
+              <w:rPr>
+                <w:bCs/>
+                <w:b/>
+              </w:rPr>
+              <w:t xml:space="preserve">05: API and production</w:t>
+            </w:r>
+          </w:p>
+        </w:tc>
+        <w:tc>
+          <w:p>
+            <w:pPr>
+              <w:pStyle w:val="Compact"/>
+              <w:jc w:val="left"/>
+            </w:pPr>
+            <w:r>
+              <w:t xml:space="preserve">FastAPI, Neon, running totals, guardrails, Docker, deployment, scaling follow-ups.</w:t>
+            </w:r>
+          </w:p>
+        </w:tc>
+      </w:tr>
     </w:tbl>
     <w:p>
       <w:pPr>
@@ -368,7 +424,55 @@
         <w:t xml:space="preserve"> </w:t>
       </w:r>
       <w:r>
-        <w:t xml:space="preserve">by gender and age. Next, I’m turning the notebooks into a production pipeline.</w:t>
+        <w:t xml:space="preserve">by gender and age. Then I took it to production: a tested, reproducible pipeline with DVC and MLflow, and a</w:t>
+      </w:r>
+      <w:r>
+        <w:t xml:space="preserve"> </w:t>
+      </w:r>
+      <w:r>
+        <w:rPr>
+          <w:bCs/>
+          <w:b/>
+        </w:rPr>
+        <w:t xml:space="preserve">live FastAPI service</w:t>
+      </w:r>
+      <w:r>
+        <w:t xml:space="preserve"> </w:t>
+      </w:r>
+      <w:r>
+        <w:t xml:space="preserve">in Docker that scores a transaction in about</w:t>
+      </w:r>
+      <w:r>
+        <w:t xml:space="preserve"> </w:t>
+      </w:r>
+      <w:r>
+        <w:rPr>
+          <w:bCs/>
+          <w:b/>
+        </w:rPr>
+        <w:t xml:space="preserve">90 ms</w:t>
+      </w:r>
+      <w:r>
+        <w:t xml:space="preserve"> </w:t>
+      </w:r>
+      <w:r>
+        <w:t xml:space="preserve">of server time, using running totals per card in Postgres and</w:t>
+      </w:r>
+      <w:r>
+        <w:t xml:space="preserve"> </w:t>
+      </w:r>
+      <w:r>
+        <w:rPr>
+          <w:bCs/>
+          <w:b/>
+        </w:rPr>
+        <w:t xml:space="preserve">guardrails</w:t>
+      </w:r>
+      <w:r>
+        <w:t xml:space="preserve"> </w:t>
+      </w:r>
+      <w:r>
+        <w:t xml:space="preserve">for inputs the model can’t judge.</w:t>
       </w:r>
       <w:r>
         <w:t xml:space="preserve">”</w:t>
@@ -876,13 +980,143 @@
           <w:bCs/>
           <w:b/>
         </w:rPr>
-        <w:t xml:space="preserve">Next:</w:t>
-      </w:r>
-      <w:r>
-        <w:t xml:space="preserve"> </w:t>
-      </w:r>
-      <w:r>
-        <w:t xml:space="preserve">a modular Python pipeline with a config file, tests, and an API.</w:t>
+        <w:t xml:space="preserve">Pipeline:</w:t>
+      </w:r>
+      <w:r>
+        <w:t xml:space="preserve"> </w:t>
+      </w:r>
+      <w:r>
+        <w:t xml:space="preserve">six tested components; every setting in</w:t>
+      </w:r>
+      <w:r>
+        <w:t xml:space="preserve"> </w:t>
+      </w:r>
+      <w:r>
+        <w:rPr>
+          <w:rStyle w:val="VerbatimChar"/>
+        </w:rPr>
+        <w:t xml:space="preserve">params.yaml</w:t>
+      </w:r>
+      <w:r>
+        <w:t xml:space="preserve">; DVC reruns only changed stages; MLflow records every run; it reproduces the notebooks exactly (0.9401 / 0.9058).</w:t>
+      </w:r>
+    </w:p>
+    <w:p>
+      <w:pPr>
+        <w:numPr>
+          <w:ilvl w:val="0"/>
+          <w:numId w:val="1001"/>
+        </w:numPr>
+        <w:pStyle w:val="Compact"/>
+      </w:pPr>
+      <w:r>
+        <w:rPr>
+          <w:bCs/>
+          <w:b/>
+        </w:rPr>
+        <w:t xml:space="preserve">Live API:</w:t>
+      </w:r>
+      <w:r>
+        <w:t xml:space="preserve"> </w:t>
+      </w:r>
+      <w:r>
+        <w:t xml:space="preserve">FastAPI in Docker on Render, next to Neon Postgres. Card state as</w:t>
+      </w:r>
+      <w:r>
+        <w:t xml:space="preserve"> </w:t>
+      </w:r>
+      <w:r>
+        <w:rPr>
+          <w:bCs/>
+          <w:b/>
+        </w:rPr>
+        <w:t xml:space="preserve">running totals</w:t>
+      </w:r>
+      <w:r>
+        <w:t xml:space="preserve"> </w:t>
+      </w:r>
+      <w:r>
+        <w:t xml:space="preserve">(storage 411 MB → 9 MB), card numbers stored only as an</w:t>
+      </w:r>
+      <w:r>
+        <w:t xml:space="preserve"> </w:t>
+      </w:r>
+      <w:r>
+        <w:rPr>
+          <w:bCs/>
+          <w:b/>
+        </w:rPr>
+        <w:t xml:space="preserve">HMAC</w:t>
+      </w:r>
+      <w:r>
+        <w:t xml:space="preserve">, a</w:t>
+      </w:r>
+      <w:r>
+        <w:t xml:space="preserve"> </w:t>
+      </w:r>
+      <w:r>
+        <w:rPr>
+          <w:bCs/>
+          <w:b/>
+        </w:rPr>
+        <w:t xml:space="preserve">parity test</w:t>
+      </w:r>
+      <w:r>
+        <w:t xml:space="preserve"> </w:t>
+      </w:r>
+      <w:r>
+        <w:t xml:space="preserve">proving the API’s features equal training’s, and about</w:t>
+      </w:r>
+      <w:r>
+        <w:t xml:space="preserve"> </w:t>
+      </w:r>
+      <w:r>
+        <w:rPr>
+          <w:bCs/>
+          <w:b/>
+        </w:rPr>
+        <w:t xml:space="preserve">90 ms</w:t>
+      </w:r>
+      <w:r>
+        <w:t xml:space="preserve"> </w:t>
+      </w:r>
+      <w:r>
+        <w:t xml:space="preserve">server-side per prediction.</w:t>
+      </w:r>
+    </w:p>
+    <w:p>
+      <w:pPr>
+        <w:numPr>
+          <w:ilvl w:val="0"/>
+          <w:numId w:val="1001"/>
+        </w:numPr>
+        <w:pStyle w:val="Compact"/>
+      </w:pPr>
+      <w:r>
+        <w:rPr>
+          <w:bCs/>
+          <w:b/>
+        </w:rPr>
+        <w:t xml:space="preserve">Stress test → guardrails:</w:t>
+      </w:r>
+      <w:r>
+        <w:t xml:space="preserve"> </w:t>
+      </w:r>
+      <w:r>
+        <w:t xml:space="preserve">extreme inputs exposed two blind spots (new cards, amounts above the training range), so those go to a third decision,</w:t>
+      </w:r>
+      <w:r>
+        <w:t xml:space="preserve"> </w:t>
+      </w:r>
+      <w:r>
+        <w:rPr>
+          <w:bCs/>
+          <w:b/>
+        </w:rPr>
+        <w:t xml:space="preserve">review</w:t>
+      </w:r>
+      <w:r>
+        <w:t xml:space="preserve">, adding only about 1 review per 3 months on validation.</w:t>
       </w:r>
     </w:p>
     <w:p>
@@ -3764,13 +3998,13 @@
       </w:r>
     </w:p>
     <w:bookmarkEnd w:id="29"/>
-    <w:bookmarkStart w:id="30" w:name="step-8-what-comes-next-production"/>
+    <w:bookmarkStart w:id="30" w:name="step-8-production-built-and-deployed"/>
     <w:p>
       <w:pPr>
         <w:pStyle w:val="Heading3"/>
       </w:pPr>
       <w:r>
-        <w:t xml:space="preserve">Step 8: What comes next (production)</w:t>
+        <w:t xml:space="preserve">Step 8: Production (built and deployed)</w:t>
       </w:r>
     </w:p>
     <w:p>
@@ -3781,7 +4015,7 @@
         <w:rPr>
           <w:rStyle w:val="VerbatimChar"/>
         </w:rPr>
-        <w:t xml:space="preserve"> params.yaml (all decisions) --&gt; features.py --&gt; train.py --&gt; evaluate.py --&gt; model file</w:t>
+        <w:t xml:space="preserve"> TRAINING:  params.yaml --&gt; ingest --&gt; validate --&gt; features --&gt; split --&gt; train --&gt; evaluate (quality gate)</w:t>
       </w:r>
       <w:r>
         <w:br/>
@@ -3790,16 +4024,19 @@
         <w:rPr>
           <w:rStyle w:val="VerbatimChar"/>
         </w:rPr>
-        <w:t xml:space="preserve">                                                                    |</w:t>
+        <w:t xml:space="preserve">            dvc repro reruns only changed stages · MLflow logs every run · pytest + CI on every push</w:t>
       </w:r>
       <w:r>
         <w:br/>
       </w:r>
       <w:r>
+        <w:br/>
+      </w:r>
+      <w:r>
         <w:rPr>
           <w:rStyle w:val="VerbatimChar"/>
         </w:rPr>
-        <w:t xml:space="preserve">            first automatic test: must reproduce val PR-AUC ~ 0.940 |</w:t>
+        <w:t xml:space="preserve"> SERVING:   transaction --&gt; FastAPI (Docker, Render, Ohio) --&gt; card state from Neon (running totals)</w:t>
       </w:r>
       <w:r>
         <w:br/>
@@ -3808,7 +4045,7 @@
         <w:rPr>
           <w:rStyle w:val="VerbatimChar"/>
         </w:rPr>
-        <w:t xml:space="preserve">                                                                    v</w:t>
+        <w:t xml:space="preserve">                        --&gt; same feature code as training --&gt; XGBoost --&gt; flag / review / approve</w:t>
       </w:r>
       <w:r>
         <w:br/>
@@ -3817,25 +4054,85 @@
         <w:rPr>
           <w:rStyle w:val="VerbatimChar"/>
         </w:rPr>
-        <w:t xml:space="preserve"> live transaction --&gt; API --&gt; card-history lookup --&gt; model --&gt; score + 3 reason codes</w:t>
-      </w:r>
-      <w:r>
-        <w:br/>
-      </w:r>
-      <w:r>
-        <w:rPr>
-          <w:rStyle w:val="VerbatimChar"/>
-        </w:rPr>
-        <w:t xml:space="preserve">                                                         |</w:t>
-      </w:r>
-      <w:r>
-        <w:br/>
-      </w:r>
-      <w:r>
-        <w:rPr>
-          <w:rStyle w:val="VerbatimChar"/>
-        </w:rPr>
-        <w:t xml:space="preserve">                                            monitoring: fraud rate, drift, precision</w:t>
+        <w:t xml:space="preserve">                        --&gt; SHAP reason codes --&gt; logged to prediction_log</w:t>
+      </w:r>
+    </w:p>
+    <w:p>
+      <w:pPr>
+        <w:numPr>
+          <w:ilvl w:val="0"/>
+          <w:numId w:val="1005"/>
+        </w:numPr>
+        <w:pStyle w:val="Compact"/>
+      </w:pPr>
+      <w:r>
+        <w:rPr>
+          <w:bCs/>
+          <w:b/>
+        </w:rPr>
+        <w:t xml:space="preserve">Proof of correctness:</w:t>
+      </w:r>
+      <w:r>
+        <w:t xml:space="preserve"> </w:t>
+      </w:r>
+      <w:r>
+        <w:t xml:space="preserve">the pipeline’s features are identical to the notebook’s; the API’s features equal the</w:t>
+      </w:r>
+      <w:r>
+        <w:t xml:space="preserve"> </w:t>
+      </w:r>
+      <w:r>
+        <w:t xml:space="preserve">pipeline’s on 2,000 test transactions.</w:t>
+      </w:r>
+    </w:p>
+    <w:p>
+      <w:pPr>
+        <w:numPr>
+          <w:ilvl w:val="0"/>
+          <w:numId w:val="1005"/>
+        </w:numPr>
+        <w:pStyle w:val="Compact"/>
+      </w:pPr>
+      <w:r>
+        <w:rPr>
+          <w:bCs/>
+          <w:b/>
+        </w:rPr>
+        <w:t xml:space="preserve">Engineering wins:</w:t>
+      </w:r>
+      <w:r>
+        <w:t xml:space="preserve"> </w:t>
+      </w:r>
+      <w:r>
+        <w:t xml:space="preserve">storage 411 MB → 8.9 MB; per-request latency from ~1.3 s (first version, from India) to</w:t>
+      </w:r>
+      <w:r>
+        <w:t xml:space="preserve"> </w:t>
+      </w:r>
+      <w:r>
+        <w:t xml:space="preserve">~90 ms server-side once deployed next to the database.</w:t>
+      </w:r>
+    </w:p>
+    <w:p>
+      <w:pPr>
+        <w:numPr>
+          <w:ilvl w:val="0"/>
+          <w:numId w:val="1005"/>
+        </w:numPr>
+        <w:pStyle w:val="Compact"/>
+      </w:pPr>
+      <w:r>
+        <w:rPr>
+          <w:bCs/>
+          <w:b/>
+        </w:rPr>
+        <w:t xml:space="preserve">Details:</w:t>
+      </w:r>
+      <w:r>
+        <w:t xml:space="preserve"> </w:t>
+      </w:r>
+      <w:r>
+        <w:t xml:space="preserve">see files 04 and 05.</w:t>
       </w:r>
     </w:p>
     <w:p>
@@ -4183,6 +4480,150 @@
           </w:p>
         </w:tc>
       </w:tr>
+      <w:tr>
+        <w:tc>
+          <w:p>
+            <w:pPr>
+              <w:pStyle w:val="Compact"/>
+              <w:jc w:val="left"/>
+            </w:pPr>
+            <w:r>
+              <w:t xml:space="preserve">Tests</w:t>
+            </w:r>
+          </w:p>
+        </w:tc>
+        <w:tc>
+          <w:p>
+            <w:pPr>
+              <w:pStyle w:val="Compact"/>
+              <w:jc w:val="left"/>
+            </w:pPr>
+            <w:r>
+              <w:t xml:space="preserve">23 (feature invariants, parity, guardrails, …)</w:t>
+            </w:r>
+          </w:p>
+        </w:tc>
+      </w:tr>
+      <w:tr>
+        <w:tc>
+          <w:p>
+            <w:pPr>
+              <w:pStyle w:val="Compact"/>
+              <w:jc w:val="left"/>
+            </w:pPr>
+            <w:r>
+              <w:t xml:space="preserve">Neon storage: full history → running totals</w:t>
+            </w:r>
+          </w:p>
+        </w:tc>
+        <w:tc>
+          <w:p>
+            <w:pPr>
+              <w:pStyle w:val="Compact"/>
+              <w:jc w:val="left"/>
+            </w:pPr>
+            <w:r>
+              <w:t xml:space="preserve">411 MB → 8.9 MB</w:t>
+            </w:r>
+          </w:p>
+        </w:tc>
+      </w:tr>
+      <w:tr>
+        <w:tc>
+          <w:p>
+            <w:pPr>
+              <w:pStyle w:val="Compact"/>
+              <w:jc w:val="left"/>
+            </w:pPr>
+            <w:r>
+              <w:t xml:space="preserve">Server-side time per prediction (live)</w:t>
+            </w:r>
+          </w:p>
+        </w:tc>
+        <w:tc>
+          <w:p>
+            <w:pPr>
+              <w:pStyle w:val="Compact"/>
+              <w:jc w:val="left"/>
+            </w:pPr>
+            <w:r>
+              <w:t xml:space="preserve">~90 ms</w:t>
+            </w:r>
+          </w:p>
+        </w:tc>
+      </w:tr>
+      <w:tr>
+        <w:tc>
+          <w:p>
+            <w:pPr>
+              <w:pStyle w:val="Compact"/>
+              <w:jc w:val="left"/>
+            </w:pPr>
+            <w:r>
+              <w:t xml:space="preserve">Guardrail limits</w:t>
+            </w:r>
+          </w:p>
+        </w:tc>
+        <w:tc>
+          <w:p>
+            <w:pPr>
+              <w:pStyle w:val="Compact"/>
+              <w:jc w:val="left"/>
+            </w:pPr>
+            <w:r>
+              <w:t xml:space="preserve">$28,948.90 (train max) · $546.72 (train 99th percentile)</w:t>
+            </w:r>
+          </w:p>
+        </w:tc>
+      </w:tr>
+      <w:tr>
+        <w:tc>
+          <w:p>
+            <w:pPr>
+              <w:pStyle w:val="Compact"/>
+              <w:jc w:val="left"/>
+            </w:pPr>
+            <w:r>
+              <w:t xml:space="preserve">Reviews added on validation</w:t>
+            </w:r>
+          </w:p>
+        </w:tc>
+        <w:tc>
+          <w:p>
+            <w:pPr>
+              <w:pStyle w:val="Compact"/>
+              <w:jc w:val="left"/>
+            </w:pPr>
+            <w:r>
+              <w:t xml:space="preserve">1 in 3 months (vs ~500/month capacity)</w:t>
+            </w:r>
+          </w:p>
+        </w:tc>
+      </w:tr>
+      <w:tr>
+        <w:tc>
+          <w:p>
+            <w:pPr>
+              <w:pStyle w:val="Compact"/>
+              <w:jc w:val="left"/>
+            </w:pPr>
+            <w:r>
+              <w:t xml:space="preserve">Docker image</w:t>
+            </w:r>
+          </w:p>
+        </w:tc>
+        <w:tc>
+          <w:p>
+            <w:pPr>
+              <w:pStyle w:val="Compact"/>
+              <w:jc w:val="left"/>
+            </w:pPr>
+            <w:r>
+              <w:t xml:space="preserve">757 MB, non-root</w:t>
+            </w:r>
+          </w:p>
+        </w:tc>
+      </w:tr>
     </w:tbl>
     <w:p>
       <w:r>
@@ -4205,7 +4646,7 @@
       <w:pPr>
         <w:numPr>
           <w:ilvl w:val="0"/>
-          <w:numId w:val="1005"/>
+          <w:numId w:val="1006"/>
         </w:numPr>
         <w:pStyle w:val="Compact"/>
       </w:pPr>
@@ -4227,7 +4668,7 @@
       <w:pPr>
         <w:numPr>
           <w:ilvl w:val="0"/>
-          <w:numId w:val="1005"/>
+          <w:numId w:val="1006"/>
         </w:numPr>
         <w:pStyle w:val="Compact"/>
       </w:pPr>
@@ -4249,7 +4690,7 @@
       <w:pPr>
         <w:numPr>
           <w:ilvl w:val="0"/>
-          <w:numId w:val="1005"/>
+          <w:numId w:val="1006"/>
         </w:numPr>
         <w:pStyle w:val="Compact"/>
       </w:pPr>
@@ -4271,7 +4712,7 @@
       <w:pPr>
         <w:numPr>
           <w:ilvl w:val="0"/>
-          <w:numId w:val="1005"/>
+          <w:numId w:val="1006"/>
         </w:numPr>
         <w:pStyle w:val="Compact"/>
       </w:pPr>
@@ -4293,7 +4734,7 @@
       <w:pPr>
         <w:numPr>
           <w:ilvl w:val="0"/>
-          <w:numId w:val="1005"/>
+          <w:numId w:val="1006"/>
         </w:numPr>
         <w:pStyle w:val="Compact"/>
       </w:pPr>
@@ -4309,6 +4750,84 @@
       </w:r>
       <w:r>
         <w:t xml:space="preserve">It got a lower learning rate, but the scores tied anyway.</w:t>
+      </w:r>
+    </w:p>
+    <w:p>
+      <w:pPr>
+        <w:numPr>
+          <w:ilvl w:val="0"/>
+          <w:numId w:val="1006"/>
+        </w:numPr>
+        <w:pStyle w:val="Compact"/>
+      </w:pPr>
+      <w:r>
+        <w:rPr>
+          <w:bCs/>
+          <w:b/>
+        </w:rPr>
+        <w:t xml:space="preserve">Two model blind spots, found by stress-testing the live API:</w:t>
+      </w:r>
+      <w:r>
+        <w:t xml:space="preserve"> </w:t>
+      </w:r>
+      <w:r>
+        <w:t xml:space="preserve">scores freeze above ~$1,200 (trees don’t extrapolate past the largest training fraud, $1,372), and brand-new cards are under-flagged (no history; the training data’s</w:t>
+      </w:r>
+      <w:r>
+        <w:t xml:space="preserve"> </w:t>
+      </w:r>
+      <w:r>
+        <w:t xml:space="preserve">“</w:t>
+      </w:r>
+      <w:r>
+        <w:t xml:space="preserve">first purchases</w:t>
+      </w:r>
+      <w:r>
+        <w:t xml:space="preserve">”</w:t>
+      </w:r>
+      <w:r>
+        <w:t xml:space="preserve"> </w:t>
+      </w:r>
+      <w:r>
+        <w:t xml:space="preserve">were just where the dataset began).</w:t>
+      </w:r>
+      <w:r>
+        <w:t xml:space="preserve"> </w:t>
+      </w:r>
+      <w:r>
+        <w:rPr>
+          <w:bCs/>
+          <w:b/>
+        </w:rPr>
+        <w:t xml:space="preserve">Mitigated</w:t>
+      </w:r>
+      <w:r>
+        <w:t xml:space="preserve"> </w:t>
+      </w:r>
+      <w:r>
+        <w:t xml:space="preserve">with guardrails that send those cases to human review.</w:t>
+      </w:r>
+    </w:p>
+    <w:p>
+      <w:pPr>
+        <w:numPr>
+          <w:ilvl w:val="0"/>
+          <w:numId w:val="1006"/>
+        </w:numPr>
+        <w:pStyle w:val="Compact"/>
+      </w:pPr>
+      <w:r>
+        <w:rPr>
+          <w:bCs/>
+          <w:b/>
+        </w:rPr>
+        <w:t xml:space="preserve">Engineering limits:</w:t>
+      </w:r>
+      <w:r>
+        <w:t xml:space="preserve"> </w:t>
+      </w:r>
+      <w:r>
+        <w:t xml:space="preserve">no idempotency yet (a retried request counts twice in a card’s totals); transactions must arrive in time order; the model files are committed to git as a deploy shortcut (the clean design pulls them with DVC in CI).</w:t>
       </w:r>
     </w:p>
     <w:p>
@@ -4647,6 +5166,9 @@
     <w:abstractNumId w:val="991"/>
   </w:num>
   <w:num w:numId="1005">
+    <w:abstractNumId w:val="991"/>
+  </w:num>
+  <w:num w:numId="1006">
     <w:abstractNumId w:val="99411"/>
     <w:lvlOverride w:ilvl="0">
       <w:startOverride w:val="1"/>

</xml_diff>